<commit_message>
Varga line's links (answer 108): Marco knows Danny from Joe in Quest 01; Nico's partners and Lucia's last line point at Crane in Quest 06; their Word pages
Co-Authored-By: Claude <noreply@anthropic.com>
Claude-Session: https://claude.ai/code/session_01RpWbq89r71C1p9HP7EcbZ5
</commit_message>
<xml_diff>
--- a/docs/quests/Quest-06-Skyline.docx
+++ b/docs/quests/Quest-06-Skyline.docx
@@ -11123,7 +11123,7 @@
                 <w:sz w:val="18"/>
                 <w:szCs w:val="18"/>
               </w:rPr>
-              <w:t>You want your little harbour? Keep it. I'm taking the sky.</w:t>
+              <w:t>You want your little harbour? Keep it. My partners are buying the sky.</w:t>
             </w:r>
           </w:p>
         </w:tc>
@@ -13294,7 +13294,7 @@
                 <w:sz w:val="18"/>
                 <w:szCs w:val="18"/>
               </w:rPr>
-              <w:t>Don't get used to quiet. Somebody always wants a harbour.</w:t>
+              <w:t>Nico was only the face. The money behind Skyline One has another name.</w:t>
             </w:r>
           </w:p>
         </w:tc>

</xml_diff>